<commit_message>
Análise da concorrencia 1/3
</commit_message>
<xml_diff>
--- a/IPL-TeSP-PSI-MDS-2526-Template_Projeto.docx
+++ b/IPL-TeSP-PSI-MDS-2526-Template_Projeto.docx
@@ -4912,18 +4912,12 @@
       <w:pPr>
         <w:pStyle w:val="Ttulo3"/>
       </w:pPr>
+      <w:proofErr w:type="spellStart"/>
       <w:r>
         <w:lastRenderedPageBreak/>
         <w:t>Listonic</w:t>
       </w:r>
-    </w:p>
-    <w:p>
-      <w:r>
-        <w:rPr>
-          <w:highlight w:val="yellow"/>
-        </w:rPr>
-        <w:t>A próxima tabela resume as características do sistema...</w:t>
-      </w:r>
+      <w:proofErr w:type="spellEnd"/>
     </w:p>
     <w:p>
       <w:pPr>
@@ -4946,13 +4940,12 @@
       <w:r>
         <w:t xml:space="preserve"> – Descrição do </w:t>
       </w:r>
-      <w:r>
-        <w:rPr>
-          <w:highlight w:val="yellow"/>
-        </w:rPr>
-        <w:t>Sistema 1</w:t>
-      </w:r>
       <w:bookmarkEnd w:id="8"/>
+      <w:proofErr w:type="spellStart"/>
+      <w:r>
+        <w:t>Listonic</w:t>
+      </w:r>
+      <w:proofErr w:type="spellEnd"/>
     </w:p>
     <w:tbl>
       <w:tblPr>
@@ -5034,14 +5027,6 @@
                 <w:bCs w:val="0"/>
               </w:rPr>
             </w:pPr>
-            <w:r>
-              <w:rPr>
-                <w:b w:val="0"/>
-                <w:bCs w:val="0"/>
-                <w:highlight w:val="yellow"/>
-              </w:rPr>
-              <w:t>&lt;colocar imagem principal&gt;</w:t>
-            </w:r>
           </w:p>
         </w:tc>
       </w:tr>
@@ -5132,10 +5117,7 @@
               <w:cnfStyle w:val="000000000000" w:firstRow="0" w:lastRow="0" w:firstColumn="0" w:lastColumn="0" w:oddVBand="0" w:evenVBand="0" w:oddHBand="0" w:evenHBand="0" w:firstRowFirstColumn="0" w:firstRowLastColumn="0" w:lastRowFirstColumn="0" w:lastRowLastColumn="0"/>
             </w:pPr>
             <w:r>
-              <w:rPr>
-                <w:highlight w:val="yellow"/>
-              </w:rPr>
-              <w:t>&lt;link do website/aplicação&gt;</w:t>
+              <w:t>https://listonic.com/pt</w:t>
             </w:r>
           </w:p>
         </w:tc>
@@ -5180,10 +5162,21 @@
               <w:cnfStyle w:val="000000100000" w:firstRow="0" w:lastRow="0" w:firstColumn="0" w:lastColumn="0" w:oddVBand="0" w:evenVBand="0" w:oddHBand="1" w:evenHBand="0" w:firstRowFirstColumn="0" w:firstRowLastColumn="0" w:lastRowFirstColumn="0" w:lastRowLastColumn="0"/>
             </w:pPr>
             <w:r>
-              <w:rPr>
-                <w:highlight w:val="yellow"/>
-              </w:rPr>
-              <w:t>&lt;descrição detalhada do website/aplicação&gt;</w:t>
+              <w:t>“</w:t>
+            </w:r>
+            <w:r>
+              <w:t xml:space="preserve">O </w:t>
+            </w:r>
+            <w:proofErr w:type="spellStart"/>
+            <w:r>
+              <w:t>Listonic</w:t>
+            </w:r>
+            <w:proofErr w:type="spellEnd"/>
+            <w:r>
+              <w:t xml:space="preserve"> ajuda-o a poupar dinheiro e tempo, tornando o planeamento de compras rápido e organizado.</w:t>
+            </w:r>
+            <w:r>
+              <w:t>”</w:t>
             </w:r>
           </w:p>
         </w:tc>
@@ -5225,10 +5218,7 @@
               <w:cnfStyle w:val="000000000000" w:firstRow="0" w:lastRow="0" w:firstColumn="0" w:lastColumn="0" w:oddVBand="0" w:evenVBand="0" w:oddHBand="0" w:evenHBand="0" w:firstRowFirstColumn="0" w:firstRowLastColumn="0" w:lastRowFirstColumn="0" w:lastRowLastColumn="0"/>
             </w:pPr>
             <w:r>
-              <w:rPr>
-                <w:highlight w:val="yellow"/>
-              </w:rPr>
-              <w:t>&lt;vantagens do website/aplicação&gt;</w:t>
+              <w:t>Controle orçamentário, sugestões personalizadas de produtos, criar e editar listas, listas compartilháveis, produtos classificados automaticamente.</w:t>
             </w:r>
           </w:p>
         </w:tc>
@@ -5273,10 +5263,16 @@
               <w:cnfStyle w:val="000000100000" w:firstRow="0" w:lastRow="0" w:firstColumn="0" w:lastColumn="0" w:oddVBand="0" w:evenVBand="0" w:oddHBand="1" w:evenHBand="0" w:firstRowFirstColumn="0" w:firstRowLastColumn="0" w:lastRowFirstColumn="0" w:lastRowLastColumn="0"/>
             </w:pPr>
             <w:r>
-              <w:rPr>
-                <w:highlight w:val="yellow"/>
-              </w:rPr>
-              <w:t>&lt;desvantagens do website/aplicação&gt;</w:t>
+              <w:t>Controlo financeiro limitado, problemas de sincronizaç</w:t>
+            </w:r>
+            <w:r>
+              <w:rPr>
+                <w:highlight w:val="yellow"/>
+              </w:rPr>
+              <w:t>ã</w:t>
+            </w:r>
+            <w:r>
+              <w:t>o, publicidade excessiva na versão gratuita, gestão de stock doméstico básico</w:t>
             </w:r>
           </w:p>
         </w:tc>
@@ -5318,10 +5314,7 @@
               <w:cnfStyle w:val="000000000000" w:firstRow="0" w:lastRow="0" w:firstColumn="0" w:lastColumn="0" w:oddVBand="0" w:evenVBand="0" w:oddHBand="0" w:evenHBand="0" w:firstRowFirstColumn="0" w:firstRowLastColumn="0" w:lastRowFirstColumn="0" w:lastRowLastColumn="0"/>
             </w:pPr>
             <w:r>
-              <w:rPr>
-                <w:highlight w:val="yellow"/>
-              </w:rPr>
-              <w:t>&lt;funcionalidades que possam faltar ao website/aplicação&gt;</w:t>
+              <w:t>Orçamento mensal familiar, alerta de excesso de gastos, comparação entre orçamento previsto e valor real, validade dos produtos, integração com supermercados.</w:t>
             </w:r>
           </w:p>
         </w:tc>
@@ -17967,7 +17960,6 @@
   <w:style w:type="character" w:default="1" w:styleId="Tipodeletrapredefinidodopargrafo">
     <w:name w:val="Default Paragraph Font"/>
     <w:uiPriority w:val="1"/>
-    <w:semiHidden/>
     <w:unhideWhenUsed/>
   </w:style>
   <w:style w:type="table" w:default="1" w:styleId="Tabelanormal">

</xml_diff>